<commit_message>
Remove instructor details from lab 4 files
</commit_message>
<xml_diff>
--- a/docs/Opash_4314_lab4.docx
+++ b/docs/Opash_4314_lab4.docx
@@ -376,92 +376,6 @@
                 <w14:ligatures w14:val="standardContextual"/>
               </w:rPr>
               <w:t>Опаш А.Б.</w:t>
-            </w:r>
-          </w:p>
-        </w:tc>
-      </w:tr>
-      <w:tr>
-        <w:trPr>
-          <w:trHeight w:val="614"/>
-        </w:trPr>
-        <w:tc>
-          <w:tcPr>
-            <w:tcW w:w="2207" w:type="pct"/>
-            <w:shd w:val="clear" w:color="auto" w:fill="FFFFFF"/>
-            <w:vAlign w:val="bottom"/>
-            <w:hideMark/>
-          </w:tcPr>
-          <w:p>
-            <w:pPr>
-              <w:spacing w:after="0"/>
-              <w:rPr>
-                <w:kern w:val="2"/>
-                <w:szCs w:val="28"/>
-                <w:lang w:val="ru-RU"/>
-                <w14:ligatures w14:val="standardContextual"/>
-              </w:rPr>
-            </w:pPr>
-            <w:r>
-              <w:rPr>
-                <w:kern w:val="2"/>
-                <w:szCs w:val="28"/>
-                <w:lang w:val="ru-RU"/>
-                <w14:ligatures w14:val="standardContextual"/>
-              </w:rPr>
-              <w:t>Преподаватель</w:t>
-            </w:r>
-          </w:p>
-        </w:tc>
-        <w:tc>
-          <w:tcPr>
-            <w:tcW w:w="1229" w:type="pct"/>
-            <w:tcBorders>
-              <w:top w:val="single" w:sz="4" w:space="0" w:color="000000"/>
-              <w:left w:val="nil"/>
-              <w:bottom w:val="single" w:sz="4" w:space="0" w:color="000000"/>
-              <w:right w:val="nil"/>
-            </w:tcBorders>
-            <w:shd w:val="clear" w:color="auto" w:fill="FFFFFF"/>
-            <w:vAlign w:val="bottom"/>
-          </w:tcPr>
-          <w:p>
-            <w:pPr>
-              <w:spacing w:after="0"/>
-              <w:rPr>
-                <w:kern w:val="2"/>
-                <w:szCs w:val="28"/>
-                <w:lang w:val="ru-RU"/>
-                <w14:ligatures w14:val="standardContextual"/>
-              </w:rPr>
-            </w:pPr>
-          </w:p>
-        </w:tc>
-        <w:tc>
-          <w:tcPr>
-            <w:tcW w:w="1564" w:type="pct"/>
-            <w:shd w:val="clear" w:color="auto" w:fill="FFFFFF"/>
-            <w:vAlign w:val="bottom"/>
-            <w:hideMark/>
-          </w:tcPr>
-          <w:p>
-            <w:pPr>
-              <w:spacing w:after="0"/>
-              <w:jc w:val="center"/>
-              <w:rPr>
-                <w:kern w:val="2"/>
-                <w:szCs w:val="28"/>
-                <w:lang w:val="ru-RU"/>
-                <w14:ligatures w14:val="standardContextual"/>
-              </w:rPr>
-            </w:pPr>
-            <w:r>
-              <w:rPr>
-                <w:kern w:val="2"/>
-                <w:szCs w:val="28"/>
-                <w:lang w:val="ru-RU"/>
-                <w14:ligatures w14:val="standardContextual"/>
-              </w:rPr>
-              <w:t>Павловский М.Г.</w:t>
             </w:r>
           </w:p>
         </w:tc>

</xml_diff>